<commit_message>
Phiếu xuất xe dạng tab theo vai; bỏ thư mục mẫu đăng nhập
- Thanh tab I–VI + Toàn phiếu dưới thanh tiến trình; vai nào vào tự mở tab
  có việc của vai đó, tab khác vẫn xem được nhưng chỉ có nút ở mục mình
  phụ trách; Toàn phiếu chỉ xem và in, ẩn nút Lưu; chấm đỏ = còn việc;
  ?tab= mở thẳng tab.
- Xoá frontend/modules/epl-login-page (đã chép vào index.html), dọn các
  ghi chú và bộ lọc phiên bản còn nhắc tới nó.
- Bộ kiểm giao diện thêm phần tab; tài liệu phân tích đánh K7 là đã làm.

Co-Authored-By: Claude Fable 5.1 <noreply@anthropic.com>
</commit_message>
<xml_diff>
--- a/DOCS/PHAN_TICH_LUONG_DO_VA_VAI.docx
+++ b/DOCS/PHAN_TICH_LUONG_DO_VA_VAI.docx
@@ -3888,7 +3888,13 @@
           <w:p>
             <w:r/>
             <w:r>
-              <w:t>Một tờ cuộn dài, mọi vai thấy cả sáu mục (ô tiền ẩn với Bãi)</w:t>
+              <w:rPr>
+                <w:b/>
+              </w:rPr>
+              <w:t>ĐÃ LÀM (18/09)</w:t>
+            </w:r>
+            <w:r>
+              <w:t>: thanh tiến trình + tab theo mục I–VI, vai nào vào tự mở tab có việc của vai đó (Bãi → mục đầu chờ nhập, KT Thu/Chi → I/II, KT kho xăng dầu và Thủ quỹ → III, KT Chi phí và Quỹ tiền mặt → IV–VI, Doanh thu/Sếp → Toàn phiếu); tab khác vẫn bấm xem được nhưng chỉ có nút ở mục mình phụ trách; tab cuối *Toàn phiếu* chỉ xem và in; chấm đỏ trên tab = còn việc</w:t>
             </w:r>
           </w:p>
         </w:tc>
@@ -3899,13 +3905,17 @@
           <w:p>
             <w:r/>
             <w:r>
-              <w:rPr>
-                <w:b/>
-              </w:rPr>
-              <w:t>Thanh tiến trình + tab theo mục</w:t>
+              <w:t xml:space="preserve">Đường dẫn </w:t>
             </w:r>
             <w:r>
-              <w:t>, vai nào vào đúng tab của vai đó, ô ngoài thẩm quyền ẩn/chỉ đọc, tab cuối *Toàn phiếu* chỉ xem và in</w:t>
+              <w:rPr>
+                <w:rFonts w:ascii="Consolas" w:hAnsi="Consolas"/>
+                <w:sz w:val="19"/>
+              </w:rPr>
+              <w:t>#/phieu-xuat-xe?id=…&amp;tab=fuel</w:t>
+            </w:r>
+            <w:r>
+              <w:t xml:space="preserve"> mở thẳng tab</w:t>
             </w:r>
           </w:p>
         </w:tc>
@@ -3928,7 +3938,7 @@
         <w:rPr>
           <w:color w:val="145C4A"/>
         </w:rPr>
-        <w:t>4. Hướng làm màn phiếu xuất xe dạng tab (K7) — để làm ngay sau khi có trả lời</w:t>
+        <w:t>4. Màn phiếu xuất xe dạng tab (K7) — đã dựng 18/09, đây là bố cục đã theo</w:t>
       </w:r>
     </w:p>
     <w:p>

</xml_diff>

<commit_message>
Bộ câu hỏi nghiệp vụ gửi EPL: ba tiếng Việt/Lào/Anh cùng tên, gửi chung anh Khampla và anh Ped
- Đổi tên CAU_HOI_NGHIEP_VU_GUI_ANH_KHAMPLA → CAU_HOI_NGHIEP_VU_EPL_VI; thêm bản
  _LAO và _EN dịch trọn, cùng số câu và cùng ô đánh dấu để đối chiếu ba bản.
- Xưng hô chung "anh Khampla, anh Ped và các anh chị bên EPL"; "Bãi cảng cạn"
  → "Kho Thabok"; sửa tham chiếu C10 → C6.1.
- README và tài liệu phân tích trỏ sang tên mới.

Co-Authored-By: Claude Fable 5.1 <noreply@anthropic.com>
</commit_message>
<xml_diff>
--- a/DOCS/PHAN_TICH_LUONG_DO_VA_VAI.docx
+++ b/DOCS/PHAN_TICH_LUONG_DO_VA_VAI.docx
@@ -43,14 +43,34 @@
         <w:jc w:val="both"/>
       </w:pPr>
       <w:r>
-        <w:t>liệu gửi anh Khampla (</w:t>
+        <w:t>liệu gửi bên EPL (</w:t>
       </w:r>
       <w:r>
         <w:rPr>
           <w:rFonts w:ascii="Consolas" w:hAnsi="Consolas"/>
           <w:sz w:val="19"/>
         </w:rPr>
-        <w:t>CAU_HOI_NGHIEP_VU_GUI_ANH_KHAMPLA.md</w:t>
+        <w:t>CAU_HOI_NGHIEP_VU_EPL_VI.md</w:t>
+      </w:r>
+      <w:r>
+        <w:t xml:space="preserve">, kèm bản Lào </w:t>
+      </w:r>
+      <w:r>
+        <w:rPr>
+          <w:rFonts w:ascii="Consolas" w:hAnsi="Consolas"/>
+          <w:sz w:val="19"/>
+        </w:rPr>
+        <w:t>_LAO</w:t>
+      </w:r>
+      <w:r>
+        <w:t xml:space="preserve"> và Anh </w:t>
+      </w:r>
+      <w:r>
+        <w:rPr>
+          <w:rFonts w:ascii="Consolas" w:hAnsi="Consolas"/>
+          <w:sz w:val="19"/>
+        </w:rPr>
+        <w:t>_EN</w:t>
       </w:r>
       <w:r>
         <w:t>).</w:t>

</xml_diff>

<commit_message>
Tên tệp bộ câu hỏi nghiệp vụ theo tiếng của từng bản: Việt, EPL_BUSINESS_QUESTIONS, ຄຳຖາມວິຊາການ_EPL
Co-Authored-By: Claude Fable 5.1 <noreply@anthropic.com>
</commit_message>
<xml_diff>
--- a/DOCS/PHAN_TICH_LUONG_DO_VA_VAI.docx
+++ b/DOCS/PHAN_TICH_LUONG_DO_VA_VAI.docx
@@ -50,27 +50,27 @@
           <w:rFonts w:ascii="Consolas" w:hAnsi="Consolas"/>
           <w:sz w:val="19"/>
         </w:rPr>
-        <w:t>CAU_HOI_NGHIEP_VU_EPL_VI.md</w:t>
-      </w:r>
-      <w:r>
-        <w:t xml:space="preserve">, kèm bản Lào </w:t>
+        <w:t>CAU_HOI_NGHIEP_VU_EPL.md</w:t>
+      </w:r>
+      <w:r>
+        <w:t xml:space="preserve">, bản Lào </w:t>
       </w:r>
       <w:r>
         <w:rPr>
           <w:rFonts w:ascii="Consolas" w:hAnsi="Consolas"/>
           <w:sz w:val="19"/>
         </w:rPr>
-        <w:t>_LAO</w:t>
-      </w:r>
-      <w:r>
-        <w:t xml:space="preserve"> và Anh </w:t>
+        <w:t>ຄຳຖາມວິຊາການ_EPL.md</w:t>
+      </w:r>
+      <w:r>
+        <w:t xml:space="preserve">, bản Anh </w:t>
       </w:r>
       <w:r>
         <w:rPr>
           <w:rFonts w:ascii="Consolas" w:hAnsi="Consolas"/>
           <w:sz w:val="19"/>
         </w:rPr>
-        <w:t>_EN</w:t>
+        <w:t>EPL_BUSINESS_QUESTIONS.md</w:t>
       </w:r>
       <w:r>
         <w:t>).</w:t>

</xml_diff>

<commit_message>
K3: bảng giá khách × tuyến, phiếu tự điền đơn giá; kế toán kiểm mục II sửa được ô tiền
- Bảng customer_rates (khách × tuyến × loại hàng, USD/tấn, giá thuê xe ngoài,
  ngày hiệu lực). API xem/thêm/sửa/xoá dưới /api/customers/{id}/bang-gia và
  /api/bang-gia/tra để hỏi giá; Bãi không có quyền xem (tiền).
- Lập/sửa phiếu có khách + tuyến mà chưa có giá → máy điền giá hợp đồng; giá
  kế toán đã gõ thì giữ.
- Ô tiền mục II (đơn giá, giá thuê, phí, ngưỡng) là thẩm quyền của người KIỂM
  mục II: duoc_sua_tien ở máy chủ, giao diện mở đúng các ô đó và nút Lưu chỉ
  gửi ô đang mở.
- Màn Khách hàng: nút Bảng giá từng khách mở khối bảng giá bên dưới.
- Gieo 2 khách × 2 tuyến (41 và 43 USD/t); bộ kiểm API và giao diện thêm phần K3.

Co-Authored-By: Claude Fable 5.1 <noreply@anthropic.com>
</commit_message>
<xml_diff>
--- a/DOCS/PHAN_TICH_LUONG_DO_VA_VAI.docx
+++ b/DOCS/PHAN_TICH_LUONG_DO_VA_VAI.docx
@@ -3724,7 +3724,13 @@
           <w:p>
             <w:r/>
             <w:r>
-              <w:t>Kế toán gõ tay đơn giá từng phiếu</w:t>
+              <w:rPr>
+                <w:b/>
+              </w:rPr>
+              <w:t>ĐÃ LÀM (18/09)</w:t>
+            </w:r>
+            <w:r>
+              <w:t>: bảng giá khách × tuyến (× loại hàng, có ngày hiệu lực) trong Danh mục khách hàng; Bãi lập phiếu không gửi giá, máy tự điền đơn giá và giá thuê xe ngoài; KT Thu/Chi VC (người kiểm mục II) sửa được ô tiền trên phiếu khi chuyến khác hợp đồng</w:t>
             </w:r>
           </w:p>
         </w:tc>
@@ -3735,7 +3741,7 @@
           <w:p>
             <w:r/>
             <w:r>
-              <w:t>Bảng giá khách × tuyến trong Danh mục, tự điền, kế toán chỉ sửa khi khác hợp đồng</w:t>
+              <w:t>Bãi không thấy bảng giá; C3.5 chỉ còn hỏi giá lấy từ đâu để nhập vào bảng</w:t>
             </w:r>
           </w:p>
         </w:tc>

</xml_diff>